<commit_message>
[agent-foundations] Point optimization pre-reading track at the optimization-thermodynamics v2 note
Replace the three source posts (and the optional fourth) in the
pre-reading instructions docx with a single link to the self-contained
note, matching the live sign-up sheet; drop the now-obsolete staleness
caveat from the module doc.

Co-Authored-By: Claude Fable 5 <noreply@anthropic.com>
Claude-Session: https://claude.ai/code/session_01CXDoCaoFxocAwLUZMWSSzX
</commit_message>
<xml_diff>
--- a/agent foundations/sources/Pre-reading instructions for Agency day_V2.docx
+++ b/agent foundations/sources/Pre-reading instructions for Agency day_V2.docx
@@ -1427,120 +1427,21 @@
           <w:bCs w:val="1"/>
         </w:rPr>
       </w:pPr>
-      <w:hyperlink r:id="rId22">
+      <w:hyperlink r:id="rId45">
         <w:r>
           <w:rPr>
             <w:color w:val="1155cc"/>
             <w:u w:val="single"/>
             <w:rtl w:val="0"/>
           </w:rPr>
-          <w:t xml:space="preserve">The ground of optimization</w:t>
+          <w:t xml:space="preserve">Optimization and thermodynamics</w:t>
         </w:r>
       </w:hyperlink>
       <w:r>
         <w:rPr>
           <w:rtl w:val="0"/>
         </w:rPr>
-        <w:t xml:space="preserve">-  Read up to and including the “Relationship to Garrabrant and Demski’s Embedded Agency” section</w:t>
-      </w:r>
-    </w:p>
-    <w:p>
-      <w:pPr>
-        <w:numPr>
-          <w:ilvl w:val="0"/>
-          <w:numId w:val="8"/>
-        </w:numPr>
-        <w:ind w:left="720" w:hanging="360"/>
-        <w:rPr>
-          <w:b w:val="1"/>
-          <w:bCs w:val="1"/>
-        </w:rPr>
-      </w:pPr>
-      <w:hyperlink r:id="rId23">
-        <w:r>
-          <w:rPr>
-            <w:color w:val="1155cc"/>
-            <w:u w:val="single"/>
-            <w:rtl w:val="0"/>
-          </w:rPr>
-          <w:t xml:space="preserve">Generalized heat engine</w:t>
-        </w:r>
-      </w:hyperlink>
-      <w:r>
-        <w:rPr>
-          <w:rtl w:val="0"/>
-        </w:rPr>
-        <w:t xml:space="preserve"> - Read Entirely</w:t>
-      </w:r>
-    </w:p>
-    <w:p>
-      <w:pPr>
-        <w:numPr>
-          <w:ilvl w:val="0"/>
-          <w:numId w:val="8"/>
-        </w:numPr>
-        <w:ind w:left="720" w:hanging="360"/>
-        <w:rPr>
-          <w:b w:val="1"/>
-          <w:bCs w:val="1"/>
-        </w:rPr>
-      </w:pPr>
-      <w:hyperlink r:id="rId24">
-        <w:r>
-          <w:rPr>
-            <w:color w:val="1155cc"/>
-            <w:u w:val="single"/>
-            <w:rtl w:val="0"/>
-          </w:rPr>
-          <w:t xml:space="preserve">Algorithmic thermodynamics and 3 types of optimization</w:t>
-        </w:r>
-      </w:hyperlink>
-      <w:r>
-        <w:rPr>
-          <w:b w:val="1"/>
-          <w:bCs w:val="1"/>
-          <w:rtl w:val="0"/>
-        </w:rPr>
-        <w:t xml:space="preserve"> - </w:t>
-      </w:r>
-      <w:r>
-        <w:rPr>
-          <w:rtl w:val="0"/>
-        </w:rPr>
-        <w:t xml:space="preserve">Read Entirely</w:t>
-      </w:r>
-    </w:p>
-    <w:p>
-      <w:pPr>
-        <w:numPr>
-          <w:ilvl w:val="0"/>
-          <w:numId w:val="8"/>
-        </w:numPr>
-        <w:ind w:left="720" w:hanging="360"/>
-        <w:rPr>
-          <w:u w:val="none"/>
-        </w:rPr>
-      </w:pPr>
-      <w:r>
-        <w:rPr>
-          <w:rtl w:val="0"/>
-        </w:rPr>
-        <w:t xml:space="preserve">Optional: </w:t>
-      </w:r>
-      <w:hyperlink r:id="rId25">
-        <w:r>
-          <w:rPr>
-            <w:color w:val="1155cc"/>
-            <w:u w:val="single"/>
-            <w:rtl w:val="0"/>
-          </w:rPr>
-          <w:t xml:space="preserve">When bits of optimization implies bits of modelling</w:t>
-        </w:r>
-      </w:hyperlink>
-      <w:r>
-        <w:rPr>
-          <w:rtl w:val="0"/>
-        </w:rPr>
+        <w:t xml:space="preserve"> - Read entirely, Appendix optional</w:t>
       </w:r>
     </w:p>
     <w:p>

</xml_diff>